<commit_message>
Lohnklausel an kantonale Lohntabelle Basel-Stadt angelehnt
Ziff. 3.1 und 3.3 der Vorlage: Orientierung an Lohnklasse 13 des
Lohngesetzes BS (Anhang 1, Lohntabelle gültig ab 1. September 2026),
ohne Anspruch auf Nachvollzug von Stufen- und Teuerungsanpassungen,
mit optionaler meilensteinabhängiger Anhebung.

Co-Authored-By: Claude Fable 5.1 <noreply@anthropic.com>
Claude-Session: https://claude.ai/code/session_01R6DdkjeoV9T4fhS8zC46Pg
</commit_message>
<xml_diff>
--- a/vertraege/arbeitsvertrag-geschaeftsfuehrung-vorlage.docx
+++ b/vertraege/arbeitsvertrag-geschaeftsfuehrung-vorlage.docx
@@ -802,7 +802,7 @@
           <w:bCs w:val="false"/>
           <w:shd w:fill="FFFF00" w:color="auto" w:val="clear"/>
         </w:rPr>
-        <w:t xml:space="preserve">[72'800]</w:t>
+        <w:t xml:space="preserve">[82'550]</w:t>
       </w:r>
       <w:r>
         <w:rPr>
@@ -817,7 +817,7 @@
           <w:bCs w:val="false"/>
           <w:shd w:fill="FFFF00" w:color="auto" w:val="clear"/>
         </w:rPr>
-        <w:t xml:space="preserve">[91'000]</w:t>
+        <w:t xml:space="preserve">[103'200]</w:t>
       </w:r>
       <w:r>
         <w:rPr>
@@ -832,14 +832,22 @@
           <w:bCs w:val="false"/>
           <w:shd w:fill="FFFF00" w:color="auto" w:val="clear"/>
         </w:rPr>
-        <w:t xml:space="preserve">[5'600]</w:t>
-      </w:r>
-      <w:r>
-        <w:rPr>
-          <w:b w:val="false"/>
-          <w:bCs w:val="false"/>
-        </w:rPr>
-        <w:t xml:space="preserve"> ausgerichtet; die dreizehnte Rate wird mit dem Dezemberlohn, bei unterjährigem Ein- oder Austritt anteilig, ausbezahlt.</w:t>
+        <w:t xml:space="preserve">[6'350]</w:t>
+      </w:r>
+      <w:r>
+        <w:rPr>
+          <w:b w:val="false"/>
+          <w:bCs w:val="false"/>
+        </w:rPr>
+        <w:t xml:space="preserve"> ausgerichtet; die dreizehnte Rate wird mit dem Dezemberlohn, bei unterjährigem Ein- oder Austritt anteilig, ausbezahlt. </w:t>
+      </w:r>
+      <w:r>
+        <w:rPr>
+          <w:b w:val="false"/>
+          <w:bCs w:val="false"/>
+          <w:shd w:fill="FFFF00" w:color="auto" w:val="clear"/>
+        </w:rPr>
+        <w:t xml:space="preserve">[Der Lohn orientiert sich an Lohnklasse 13 des Lohngesetzes des Kantons Basel-Stadt (Lohntabelle gültig ab 1. September 2026). Ein Anspruch auf Nachvollzug der kantonalen Stufen- und Teuerungsanpassungen besteht nicht.]</w:t>
       </w:r>
     </w:p>
     <w:p>
@@ -900,7 +908,22 @@
           <w:b w:val="false"/>
           <w:bCs w:val="false"/>
         </w:rPr>
-        <w:t xml:space="preserve">. Ein Anspruch auf Anpassung besteht nicht.</w:t>
+        <w:t xml:space="preserve">, und orientiert sich dabei am Stufenverlauf und an der Teuerungsanpassung des Kantons Basel-Stadt. </w:t>
+      </w:r>
+      <w:r>
+        <w:rPr>
+          <w:b w:val="false"/>
+          <w:bCs w:val="false"/>
+          <w:shd w:fill="FFFF00" w:color="auto" w:val="clear"/>
+        </w:rPr>
+        <w:t xml:space="preserve">[Erreicht der Verein bis zum 30. Juni 2027 mindestens 15 belegte Lernbus-Plätze oder für das folgende Vereinsjahr gesicherte Beiträge von CHF 150'000, so wird der Jahresbruttolohn auf den 1. Juli 2027 auf CHF 87'750 (dreizehn Raten von CHF 6'750) angehoben.]</w:t>
+      </w:r>
+      <w:r>
+        <w:rPr>
+          <w:b w:val="false"/>
+          <w:bCs w:val="false"/>
+        </w:rPr>
+        <w:t xml:space="preserve"> Ein weitergehender Anspruch auf Anpassung besteht nicht.</w:t>
       </w:r>
     </w:p>
     <w:p>

</xml_diff>